<commit_message>
Optimize /upload-simple: use ultra_fast_background_processing for faster uploads on PythonAnywhere
</commit_message>
<xml_diff>
--- a/src/templates/horizontal.docx
+++ b/src/templates/horizontal.docx
@@ -62,7 +62,7 @@
             <w:tr>
               <w:trPr>
                 <w:cantSplit/>
-                <w:trHeight w:val="1848"/>
+                <w:trHeight w:val="1783"/>
                 <w:jc w:val="center"/>
               </w:trPr>
               <w:tc>
@@ -253,8 +253,8 @@
             </w:tblPr>
             <w:tblGrid>
               <w:gridCol w:w="1842"/>
-              <w:gridCol w:w="1087"/>
-              <w:gridCol w:w="1841"/>
+              <w:gridCol w:w="1128"/>
+              <w:gridCol w:w="1800"/>
             </w:tblGrid>
             <w:tr>
               <w:trPr>
@@ -264,7 +264,7 @@
               </w:trPr>
               <w:tc>
                 <w:tcPr>
-                  <w:tcW w:w="1829" w:type="dxa"/>
+                  <w:tcW w:w="1842" w:type="dxa"/>
                   <w:tcBorders>
                     <w:top w:val="nil"/>
                     <w:left w:val="nil"/>
@@ -304,7 +304,7 @@
               </w:tc>
               <w:tc>
                 <w:tcPr>
-                  <w:tcW w:w="1080" w:type="dxa"/>
+                  <w:tcW w:w="1128" w:type="dxa"/>
                   <w:tcBorders>
                     <w:top w:val="nil"/>
                     <w:left w:val="nil"/>
@@ -346,7 +346,7 @@
               </w:tc>
               <w:tc>
                 <w:tcPr>
-                  <w:tcW w:w="1829" w:type="dxa"/>
+                  <w:tcW w:w="1800" w:type="dxa"/>
                   <w:tcBorders>
                     <w:top w:val="nil"/>
                     <w:left w:val="nil"/>

</xml_diff>